<commit_message>
add intro and concept to the preliminary report
</commit_message>
<xml_diff>
--- a/docs/preliminary-report/Preliminary Report.docx
+++ b/docs/preliminary-report/Preliminary Report.docx
@@ -19,6 +19,17 @@
     </w:p>
     <w:sdt>
       <w:sdtPr>
+        <w:rPr>
+          <w:rFonts w:asciiTheme="minorHAnsi" w:eastAsiaTheme="minorHAnsi" w:hAnsiTheme="minorHAnsi" w:cstheme="minorBidi"/>
+          <w:b w:val="0"/>
+          <w:bCs w:val="0"/>
+          <w:color w:val="auto"/>
+          <w:kern w:val="2"/>
+          <w:sz w:val="24"/>
+          <w:szCs w:val="24"/>
+          <w:lang w:val="en-CA"/>
+          <w14:ligatures w14:val="standardContextual"/>
+        </w:rPr>
         <w:id w:val="347607979"/>
         <w:docPartObj>
           <w:docPartGallery w:val="Table of Contents"/>
@@ -27,14 +38,7 @@
       </w:sdtPr>
       <w:sdtEndPr>
         <w:rPr>
-          <w:rFonts w:asciiTheme="minorHAnsi" w:eastAsiaTheme="minorHAnsi" w:hAnsiTheme="minorHAnsi" w:cstheme="minorBidi"/>
           <w:noProof/>
-          <w:color w:val="auto"/>
-          <w:kern w:val="2"/>
-          <w:sz w:val="24"/>
-          <w:szCs w:val="24"/>
-          <w:lang w:val="en-CA"/>
-          <w14:ligatures w14:val="standardContextual"/>
         </w:rPr>
       </w:sdtEndPr>
       <w:sdtContent>
@@ -1948,43 +1952,347 @@
     <w:p>
       <w:pPr>
         <w:pStyle w:val="Heading3"/>
+        <w:rPr>
+          <w:rFonts w:asciiTheme="majorHAnsi" w:hAnsiTheme="majorHAnsi" w:cstheme="majorHAnsi"/>
+        </w:rPr>
       </w:pPr>
       <w:bookmarkStart w:id="2" w:name="_Toc231657481"/>
-      <w:r>
+      <w:bookmarkStart w:id="3" w:name="_Toc231657483"/>
+      <w:r>
+        <w:rPr>
+          <w:rFonts w:asciiTheme="majorHAnsi" w:hAnsiTheme="majorHAnsi" w:cstheme="majorHAnsi"/>
+        </w:rPr>
+        <w:t>Chosen Template</w:t>
+      </w:r>
+      <w:bookmarkEnd w:id="3"/>
+    </w:p>
+    <w:p>
+      <w:pPr>
+        <w:spacing w:line="276" w:lineRule="auto"/>
+      </w:pPr>
+      <w:r>
+        <w:t xml:space="preserve">For this project I </w:t>
+      </w:r>
+      <w:r>
+        <w:t>chose</w:t>
+      </w:r>
+      <w:r>
+        <w:t xml:space="preserve"> the </w:t>
+      </w:r>
+      <w:r>
+        <w:t>“</w:t>
+      </w:r>
+      <w:r>
+        <w:t>Project Idea: 2 Financial Advisor Bot</w:t>
+      </w:r>
+      <w:r>
+        <w:t>”</w:t>
+      </w:r>
+      <w:r>
+        <w:t xml:space="preserve"> template. The project involves designing and implementing an AI system with a user-facing application, evaluating its performance using quantitative metrics, and testing the output with real users.</w:t>
+      </w:r>
+    </w:p>
+    <w:p>
+      <w:pPr>
+        <w:pStyle w:val="Heading3"/>
+        <w:rPr>
+          <w:rFonts w:asciiTheme="majorHAnsi" w:hAnsiTheme="majorHAnsi" w:cstheme="majorHAnsi"/>
+        </w:rPr>
+      </w:pPr>
+    </w:p>
+    <w:p>
+      <w:pPr>
+        <w:pStyle w:val="Heading3"/>
+        <w:rPr>
+          <w:rFonts w:asciiTheme="majorHAnsi" w:hAnsiTheme="majorHAnsi" w:cstheme="majorHAnsi"/>
+        </w:rPr>
+      </w:pPr>
+      <w:r>
+        <w:rPr>
+          <w:rFonts w:asciiTheme="majorHAnsi" w:hAnsiTheme="majorHAnsi" w:cstheme="majorHAnsi"/>
+        </w:rPr>
         <w:t>Project Concept</w:t>
       </w:r>
       <w:bookmarkEnd w:id="2"/>
+    </w:p>
+    <w:p>
+      <w:pPr>
+        <w:shd w:val="clear" w:color="auto" w:fill="FFFFFF"/>
+        <w:spacing w:after="0" w:line="276" w:lineRule="auto"/>
+        <w:rPr>
+          <w:rFonts w:eastAsia="Times New Roman" w:cstheme="minorHAnsi"/>
+          <w:color w:val="3B3B3B"/>
+          <w:kern w:val="0"/>
+          <w14:ligatures w14:val="none"/>
+        </w:rPr>
+      </w:pPr>
+      <w:bookmarkStart w:id="4" w:name="_Toc231657482"/>
+      <w:r>
+        <w:rPr>
+          <w:rFonts w:eastAsia="Times New Roman" w:cstheme="minorHAnsi"/>
+          <w:color w:val="3B3B3B"/>
+          <w:kern w:val="0"/>
+          <w14:ligatures w14:val="none"/>
+        </w:rPr>
+        <w:t xml:space="preserve">I am building a financial advisor bot that analyses stock market data and gives a non-technical retail investor a plain-language recommendation about whether a stock looks like a buy, sell, or hold. The application considers a portfolio of stocks rather than looking at each stock in isolation. This means the recommendation for one ticker accounts for the user's positions in other tickers, so the system makes decisions based on the overall portfolio state. This balances potential risk and reward. The first version focuses on equities listed on the TSX, NYSE, and NASDAQ exchanges. I will daily </w:t>
+      </w:r>
+      <w:proofErr w:type="gramStart"/>
+      <w:r>
+        <w:rPr>
+          <w:rFonts w:eastAsia="Times New Roman" w:cstheme="minorHAnsi"/>
+          <w:color w:val="3B3B3B"/>
+          <w:kern w:val="0"/>
+          <w14:ligatures w14:val="none"/>
+        </w:rPr>
+        <w:t>historical</w:t>
+      </w:r>
+      <w:proofErr w:type="gramEnd"/>
+      <w:r>
+        <w:rPr>
+          <w:rFonts w:eastAsia="Times New Roman" w:cstheme="minorHAnsi"/>
+          <w:color w:val="3B3B3B"/>
+          <w:kern w:val="0"/>
+          <w14:ligatures w14:val="none"/>
+        </w:rPr>
+        <w:t xml:space="preserve"> price data from the </w:t>
+      </w:r>
+      <w:proofErr w:type="spellStart"/>
+      <w:r>
+        <w:rPr>
+          <w:rFonts w:eastAsia="Times New Roman" w:cstheme="minorHAnsi"/>
+          <w:color w:val="3B3B3B"/>
+          <w:kern w:val="0"/>
+          <w14:ligatures w14:val="none"/>
+        </w:rPr>
+        <w:t>yfinance</w:t>
+      </w:r>
+      <w:proofErr w:type="spellEnd"/>
+      <w:r>
+        <w:rPr>
+          <w:rFonts w:eastAsia="Times New Roman" w:cstheme="minorHAnsi"/>
+          <w:color w:val="3B3B3B"/>
+          <w:kern w:val="0"/>
+          <w14:ligatures w14:val="none"/>
+        </w:rPr>
+        <w:t xml:space="preserve"> library.  The user will interact with the application through a web interface with a primarily chat UI.</w:t>
+      </w:r>
     </w:p>
     <w:p>
       <w:pPr>
         <w:pStyle w:val="Heading3"/>
       </w:pPr>
-      <w:bookmarkStart w:id="3" w:name="_Toc231657482"/>
-      <w:r>
-        <w:t>Motivation</w:t>
-      </w:r>
-      <w:bookmarkEnd w:id="3"/>
     </w:p>
     <w:p>
       <w:pPr>
         <w:pStyle w:val="Heading3"/>
+        <w:rPr>
+          <w:rFonts w:asciiTheme="majorHAnsi" w:hAnsiTheme="majorHAnsi" w:cstheme="majorHAnsi"/>
+        </w:rPr>
       </w:pPr>
-      <w:bookmarkStart w:id="4" w:name="_Toc231657483"/>
-      <w:r>
-        <w:t>Chosen Template</w:t>
+      <w:r>
+        <w:rPr>
+          <w:rFonts w:asciiTheme="majorHAnsi" w:hAnsiTheme="majorHAnsi" w:cstheme="majorHAnsi"/>
+        </w:rPr>
+        <w:t>Motivation</w:t>
       </w:r>
       <w:bookmarkEnd w:id="4"/>
     </w:p>
+    <w:p>
+      <w:pPr>
+        <w:spacing w:after="0" w:line="276" w:lineRule="auto"/>
+      </w:pPr>
+      <w:r>
+        <w:t xml:space="preserve">Retail investors </w:t>
+      </w:r>
+      <w:r>
+        <w:t xml:space="preserve">have a </w:t>
+      </w:r>
+      <w:r>
+        <w:t>problem</w:t>
+      </w:r>
+      <w:r>
+        <w:t xml:space="preserve"> where t</w:t>
+      </w:r>
+      <w:r>
+        <w:t xml:space="preserve">he tools that exist to help them analyse stocks </w:t>
+      </w:r>
+      <w:r>
+        <w:t>are either too simple or too complex.  Charting</w:t>
+      </w:r>
+      <w:r>
+        <w:t xml:space="preserve"> </w:t>
+      </w:r>
+      <w:r>
+        <w:t>applications</w:t>
+      </w:r>
+      <w:r>
+        <w:t xml:space="preserve"> that show raw price and volume data but leave all interpretation to the user</w:t>
+      </w:r>
+      <w:r>
+        <w:t xml:space="preserve"> are too simple</w:t>
+      </w:r>
+      <w:r>
+        <w:t xml:space="preserve">. </w:t>
+      </w:r>
+      <w:r>
+        <w:t>S</w:t>
+      </w:r>
+      <w:r>
+        <w:t>ophisticated quantitative analysis platforms aimed at professional traders or institutional investors</w:t>
+      </w:r>
+      <w:r>
+        <w:t xml:space="preserve"> are too complex and</w:t>
+      </w:r>
+      <w:r>
+        <w:t xml:space="preserve"> require domain expertise to use effectively.</w:t>
+      </w:r>
+    </w:p>
+    <w:p>
+      <w:pPr>
+        <w:spacing w:after="0" w:line="276" w:lineRule="auto"/>
+      </w:pPr>
+      <w:r>
+        <w:t>There is a gap between these 2 categories</w:t>
+      </w:r>
+      <w:r>
+        <w:t xml:space="preserve"> for an application geared to a</w:t>
+      </w:r>
+      <w:r>
+        <w:t xml:space="preserve"> non-technical investor</w:t>
+      </w:r>
+      <w:r>
+        <w:t xml:space="preserve">, </w:t>
+      </w:r>
+      <w:r>
+        <w:t>who owns a portfolio of 5 to 10 stocks</w:t>
+      </w:r>
+      <w:r>
+        <w:t xml:space="preserve"> and</w:t>
+      </w:r>
+      <w:r>
+        <w:t xml:space="preserve"> has no practical access to AI-driven analysis</w:t>
+      </w:r>
+      <w:r>
+        <w:t>,</w:t>
+      </w:r>
+      <w:r>
+        <w:t xml:space="preserve"> that understands their portfolio as a whole and communicates its findings in plain English. Tools like </w:t>
+      </w:r>
+      <w:proofErr w:type="spellStart"/>
+      <w:r>
+        <w:t>Danelfin</w:t>
+      </w:r>
+      <w:proofErr w:type="spellEnd"/>
+      <w:r>
+        <w:t xml:space="preserve"> come closest, using machine learning to score individual stocks. However, </w:t>
+      </w:r>
+      <w:proofErr w:type="spellStart"/>
+      <w:r>
+        <w:t>Danelfin</w:t>
+      </w:r>
+      <w:proofErr w:type="spellEnd"/>
+      <w:r>
+        <w:t xml:space="preserve"> does not account for portfolio-level context: it assesses each stock as if the user holds nothing else, which means its recommendations can conflict with each other or ignore available cash and existing positions.</w:t>
+      </w:r>
+    </w:p>
+    <w:p>
+      <w:pPr>
+        <w:spacing w:after="0" w:line="276" w:lineRule="auto"/>
+      </w:pPr>
+      <w:r>
+        <w:t>This project addresses that gap. It uses a 2-stage AI architecture to separate prediction from decision</w:t>
+      </w:r>
+      <w:r>
+        <w:t>.  What will the stock do tomorrow vs how much should I buy/sell/hold</w:t>
+      </w:r>
+      <w:r>
+        <w:t>. A plain-language explanation layer then translates the structured model output into advice a non-technical user can understand and act on.</w:t>
+      </w:r>
+    </w:p>
+    <w:p/>
     <w:p>
       <w:pPr>
         <w:pStyle w:val="Heading2"/>
       </w:pPr>
       <w:bookmarkStart w:id="5" w:name="_Toc231657484"/>
       <w:r>
+        <w:lastRenderedPageBreak/>
         <w:t>Literature Review</w:t>
       </w:r>
       <w:bookmarkEnd w:id="5"/>
     </w:p>
+    <w:p>
+      <w:r>
+        <w:t xml:space="preserve">I </w:t>
+      </w:r>
+      <w:r>
+        <w:t>reviewed</w:t>
+      </w:r>
+      <w:r>
+        <w:t xml:space="preserve"> 5 peer-reviewed papers </w:t>
+      </w:r>
+      <w:r>
+        <w:t>centered</w:t>
+      </w:r>
+      <w:r>
+        <w:t xml:space="preserve"> around </w:t>
+      </w:r>
+      <w:r>
+        <w:t xml:space="preserve">the </w:t>
+      </w:r>
+      <w:r>
+        <w:t xml:space="preserve">3 </w:t>
+      </w:r>
+      <w:r>
+        <w:t xml:space="preserve">key design </w:t>
+      </w:r>
+      <w:r>
+        <w:t xml:space="preserve">concepts in this project: </w:t>
+      </w:r>
+      <w:r>
+        <w:t>using</w:t>
+      </w:r>
+      <w:r>
+        <w:t xml:space="preserve"> </w:t>
+      </w:r>
+      <w:r>
+        <w:t xml:space="preserve">an </w:t>
+      </w:r>
+      <w:r>
+        <w:t xml:space="preserve">LSTM </w:t>
+      </w:r>
+      <w:r>
+        <w:t xml:space="preserve">model </w:t>
+      </w:r>
+      <w:r>
+        <w:t>as the prediction architecture for time-series</w:t>
+      </w:r>
+      <w:r>
+        <w:t xml:space="preserve"> data</w:t>
+      </w:r>
+      <w:r>
+        <w:t xml:space="preserve">, </w:t>
+      </w:r>
+      <w:r>
+        <w:t>using an RL model</w:t>
+      </w:r>
+      <w:r>
+        <w:t xml:space="preserve"> for portfolio-level decision making, and </w:t>
+      </w:r>
+      <w:r>
+        <w:t xml:space="preserve">guidance on which </w:t>
+      </w:r>
+      <w:r>
+        <w:t>technical indicators</w:t>
+      </w:r>
+      <w:r>
+        <w:t xml:space="preserve"> to select</w:t>
+      </w:r>
+      <w:r>
+        <w:t xml:space="preserve"> as input features.</w:t>
+      </w:r>
+    </w:p>
+    <w:p/>
     <w:p>
       <w:pPr>
         <w:pStyle w:val="Heading3"/>
@@ -1996,6 +2304,12 @@
       <w:bookmarkEnd w:id="6"/>
     </w:p>
     <w:p>
+      <w:r>
+        <w:t>Content here</w:t>
+      </w:r>
+    </w:p>
+    <w:p/>
+    <w:p>
       <w:pPr>
         <w:pStyle w:val="Heading3"/>
       </w:pPr>
@@ -2006,6 +2320,12 @@
       <w:bookmarkEnd w:id="7"/>
     </w:p>
     <w:p>
+      <w:r>
+        <w:t>Content here</w:t>
+      </w:r>
+    </w:p>
+    <w:p/>
+    <w:p>
       <w:pPr>
         <w:pStyle w:val="Heading3"/>
       </w:pPr>
@@ -2016,6 +2336,12 @@
       <w:bookmarkEnd w:id="8"/>
     </w:p>
     <w:p>
+      <w:r>
+        <w:t>Content here</w:t>
+      </w:r>
+    </w:p>
+    <w:p/>
+    <w:p>
       <w:pPr>
         <w:pStyle w:val="Heading3"/>
       </w:pPr>
@@ -2026,6 +2352,12 @@
       <w:bookmarkEnd w:id="9"/>
     </w:p>
     <w:p>
+      <w:r>
+        <w:t>Content here</w:t>
+      </w:r>
+    </w:p>
+    <w:p/>
+    <w:p>
       <w:pPr>
         <w:pStyle w:val="Heading2"/>
       </w:pPr>
@@ -2036,6 +2368,12 @@
       <w:bookmarkEnd w:id="10"/>
     </w:p>
     <w:p>
+      <w:r>
+        <w:t>Content here</w:t>
+      </w:r>
+    </w:p>
+    <w:p/>
+    <w:p>
       <w:pPr>
         <w:pStyle w:val="Heading3"/>
       </w:pPr>
@@ -2046,6 +2384,12 @@
       <w:bookmarkEnd w:id="11"/>
     </w:p>
     <w:p>
+      <w:r>
+        <w:t>Content here</w:t>
+      </w:r>
+    </w:p>
+    <w:p/>
+    <w:p>
       <w:pPr>
         <w:pStyle w:val="Heading3"/>
       </w:pPr>
@@ -2056,15 +2400,28 @@
       <w:bookmarkEnd w:id="12"/>
     </w:p>
     <w:p>
+      <w:r>
+        <w:t>Content here</w:t>
+      </w:r>
+    </w:p>
+    <w:p/>
+    <w:p>
       <w:pPr>
         <w:pStyle w:val="Heading3"/>
       </w:pPr>
       <w:bookmarkStart w:id="13" w:name="_Toc231657492"/>
       <w:r>
+        <w:lastRenderedPageBreak/>
         <w:t>LSTM Model</w:t>
       </w:r>
       <w:bookmarkEnd w:id="13"/>
     </w:p>
+    <w:p>
+      <w:r>
+        <w:t>Content here</w:t>
+      </w:r>
+    </w:p>
+    <w:p/>
     <w:p>
       <w:pPr>
         <w:pStyle w:val="Heading3"/>
@@ -2076,6 +2433,12 @@
       <w:bookmarkEnd w:id="14"/>
     </w:p>
     <w:p>
+      <w:r>
+        <w:t>Content here</w:t>
+      </w:r>
+    </w:p>
+    <w:p/>
+    <w:p>
       <w:pPr>
         <w:pStyle w:val="Heading3"/>
       </w:pPr>
@@ -2086,6 +2449,12 @@
       <w:bookmarkEnd w:id="15"/>
     </w:p>
     <w:p>
+      <w:r>
+        <w:t>Content here</w:t>
+      </w:r>
+    </w:p>
+    <w:p/>
+    <w:p>
       <w:pPr>
         <w:pStyle w:val="Heading3"/>
       </w:pPr>
@@ -2096,6 +2465,12 @@
       <w:bookmarkEnd w:id="16"/>
     </w:p>
     <w:p>
+      <w:r>
+        <w:t>Content here</w:t>
+      </w:r>
+    </w:p>
+    <w:p/>
+    <w:p>
       <w:pPr>
         <w:pStyle w:val="Heading3"/>
       </w:pPr>
@@ -2106,6 +2481,12 @@
       <w:bookmarkEnd w:id="17"/>
     </w:p>
     <w:p>
+      <w:r>
+        <w:t>Content here</w:t>
+      </w:r>
+    </w:p>
+    <w:p/>
+    <w:p>
       <w:pPr>
         <w:pStyle w:val="Heading2"/>
       </w:pPr>
@@ -2116,6 +2497,12 @@
       <w:bookmarkEnd w:id="18"/>
     </w:p>
     <w:p>
+      <w:r>
+        <w:t>Content here</w:t>
+      </w:r>
+    </w:p>
+    <w:p/>
+    <w:p>
       <w:pPr>
         <w:pStyle w:val="Heading3"/>
       </w:pPr>
@@ -2126,6 +2513,12 @@
       <w:bookmarkEnd w:id="19"/>
     </w:p>
     <w:p>
+      <w:r>
+        <w:t>Content here</w:t>
+      </w:r>
+    </w:p>
+    <w:p/>
+    <w:p>
       <w:pPr>
         <w:pStyle w:val="Heading3"/>
       </w:pPr>
@@ -2136,6 +2529,12 @@
       <w:bookmarkEnd w:id="20"/>
     </w:p>
     <w:p>
+      <w:r>
+        <w:t>Content here</w:t>
+      </w:r>
+    </w:p>
+    <w:p/>
+    <w:p>
       <w:pPr>
         <w:pStyle w:val="Heading3"/>
       </w:pPr>
@@ -2146,6 +2545,12 @@
       <w:bookmarkEnd w:id="21"/>
     </w:p>
     <w:p>
+      <w:r>
+        <w:t>Content here</w:t>
+      </w:r>
+    </w:p>
+    <w:p/>
+    <w:p>
       <w:pPr>
         <w:pStyle w:val="Heading3"/>
       </w:pPr>
@@ -2156,6 +2561,12 @@
       <w:bookmarkEnd w:id="22"/>
     </w:p>
     <w:p>
+      <w:r>
+        <w:t>Content here</w:t>
+      </w:r>
+    </w:p>
+    <w:p/>
+    <w:p>
       <w:pPr>
         <w:pStyle w:val="Heading3"/>
       </w:pPr>
@@ -2166,16 +2577,27 @@
       <w:bookmarkEnd w:id="23"/>
     </w:p>
     <w:p>
+      <w:r>
+        <w:t>Content here</w:t>
+      </w:r>
+    </w:p>
+    <w:p/>
+    <w:p>
       <w:pPr>
         <w:pStyle w:val="Heading3"/>
       </w:pPr>
       <w:bookmarkStart w:id="24" w:name="_Toc231657503"/>
       <w:r>
-        <w:lastRenderedPageBreak/>
         <w:t>How I would Improve It</w:t>
       </w:r>
       <w:bookmarkEnd w:id="24"/>
     </w:p>
+    <w:p>
+      <w:r>
+        <w:t>Content here</w:t>
+      </w:r>
+    </w:p>
+    <w:p/>
     <w:p>
       <w:pPr>
         <w:pStyle w:val="Heading2"/>
@@ -2186,6 +2608,12 @@
       </w:r>
       <w:bookmarkEnd w:id="25"/>
     </w:p>
+    <w:p>
+      <w:r>
+        <w:t>Content here</w:t>
+      </w:r>
+    </w:p>
+    <w:p/>
     <w:sectPr>
       <w:pgSz w:w="12240" w:h="15840"/>
       <w:pgMar w:top="1440" w:right="1440" w:bottom="1440" w:left="1440" w:header="708" w:footer="708" w:gutter="0"/>
@@ -2797,7 +3225,6 @@
   <w:style w:type="character" w:default="1" w:styleId="DefaultParagraphFont">
     <w:name w:val="Default Paragraph Font"/>
     <w:uiPriority w:val="1"/>
-    <w:semiHidden/>
     <w:unhideWhenUsed/>
   </w:style>
   <w:style w:type="table" w:default="1" w:styleId="TableNormal">

</xml_diff>